<commit_message>
Update overview with AI Integration and recent features
Co-Authored-By: Claude Opus 4.8 <noreply@anthropic.com>
</commit_message>
<xml_diff>
--- a/MathHoot-Overview.docx
+++ b/MathHoot-Overview.docx
@@ -110,7 +110,7 @@
     </w:p>
     <w:p>
       <w:r>
-        <w:t xml:space="preserve">The game then presents questions one at a time on color-coded answer tiles with a live countdown, and ends with a results screen.</w:t>
+        <w:t xml:space="preserve">The game then presents questions one at a time on color-coded answer tiles with a live countdown — each question labelled with its difficulty level, and quittable at any point — and ends with a results screen.</w:t>
       </w:r>
     </w:p>
     <w:p>
@@ -139,7 +139,16 @@
         <w:t xml:space="preserve">kind</w:t>
       </w:r>
       <w:r>
-        <w:t xml:space="preserve"> of problem, spanning introductory arithmetic up to genuine university-level material (logarithms, matrices, complex numbers, vectors, infinite series, calculus, and more).</w:t>
+        <w:t xml:space="preserve"> of problem, spanning introductory arithmetic up to genuine university-level material (logarithms, matrices, complex numbers, vectors, infinite series, calculus, and more). A built-in </w:t>
+      </w:r>
+      <w:r>
+        <w:rPr>
+          <w:b/>
+        </w:rPr>
+        <w:t xml:space="preserve">question catalog</w:t>
+      </w:r>
+      <w:r>
+        <w:t xml:space="preserve"> shows how many templates exist for each topic and difficulty level — and any number can be tapped to view the templates themselves.</w:t>
       </w:r>
     </w:p>
     <w:p>
@@ -196,10 +205,21 @@
         <w:rPr>
           <w:b/>
         </w:rPr>
+        <w:t xml:space="preserve">AI Integration. </w:t>
+      </w:r>
+      <w:r>
+        <w:t xml:space="preserve">Describe a quiz in plain English and Claude (Anthropic’s AI) writes the whole set — questions, four answer choices, the correct answer, and a short explanation for each — saved directly to your question sets to play solo or host live. Because MathHoot runs entirely in the browser, it uses your own Anthropic API key, stored only on your device.</w:t>
+      </w:r>
+    </w:p>
+    <w:p>
+      <w:r>
+        <w:rPr>
+          <w:b/>
+        </w:rPr>
         <w:t xml:space="preserve">Accounts and live classroom games. </w:t>
       </w:r>
       <w:r>
-        <w:t xml:space="preserve">A free account (teacher or student) syncs sets, history, and preferences across devices, and student accounts get </w:t>
+        <w:t xml:space="preserve">A free account (teacher or student) syncs sets, history, and preferences across devices — with email-based password reset — and student accounts get </w:t>
       </w:r>
       <w:r>
         <w:rPr>

</xml_diff>

<commit_message>
Overview one-pager: add Accessibility & language feature
Co-Authored-By: Claude Opus 4.8 <noreply@anthropic.com>
</commit_message>
<xml_diff>
--- a/MathHoot-Overview.docx
+++ b/MathHoot-Overview.docx
@@ -238,6 +238,26 @@
       </w:r>
       <w:r>
         <w:t xml:space="preserve"> — a custom set or a generated quiz — and students join with a code on their own devices. The teacher drives it question by question, Kahoot-style, with a live leaderboard, all in real time and with no extra server.</w:t>
+      </w:r>
+    </w:p>
+    <w:p>
+      <w:r>
+        <w:rPr>
+          <w:b/>
+        </w:rPr>
+        <w:t xml:space="preserve">Accessible and multilingual. </w:t>
+      </w:r>
+      <w:r>
+        <w:t xml:space="preserve">An </w:t>
+      </w:r>
+      <w:r>
+        <w:rPr>
+          <w:b/>
+        </w:rPr>
+        <w:t xml:space="preserve">Accessibility &amp; language</w:t>
+      </w:r>
+      <w:r>
+        <w:t xml:space="preserve"> panel adds high-contrast, larger-text, readable-spacing, and reduced-motion display modes, plus screen-reader labels on the questions and answers, and an interface language selector (English / Español). Choices are saved to your preferences.</w:t>
       </w:r>
     </w:p>
     <w:p>

</xml_diff>